<commit_message>
Add DeepPCB training code and measured results
</commit_message>
<xml_diff>
--- a/documents/pcb_thesis_deeppcb_revised.docx
+++ b/documents/pcb_thesis_deeppcb_revised.docx
@@ -366,10 +366,7 @@
         <w:ind w:firstLine="420"/>
       </w:pPr>
       <w:r>
-        <w:rPr>
-          <w:rFonts w:ascii="Noto Serif CJK SC" w:hAnsi="Noto Serif CJK SC" w:eastAsia="Noto Serif CJK SC" w:cs="Noto Serif CJK SC"/>
-        </w:rPr>
-        <w:t>目前尚未完成 DeepPCB 上的训练与测试。本稿给出可执行的数据转换、模型设计和评价方案；各项性能数据、统计检验与最终结论均标为待实测，须在实验完成后填写。</w:t>
+        <w:t>目前已完成一次 10 epoch、320 输入的 CPU 预备训练与测试。本稿将该结果用于核对流程，正式性能结论仍需增加训练轮次和随机种子后确认。</w:t>
       </w:r>
     </w:p>
     <w:p>
@@ -1203,10 +1200,7 @@
         <w:ind w:firstLine="420"/>
       </w:pPr>
       <w:r>
-        <w:rPr>
-          <w:rFonts w:ascii="Noto Serif CJK SC" w:hAnsi="Noto Serif CJK SC" w:eastAsia="Noto Serif CJK SC" w:cs="Noto Serif CJK SC"/>
-        </w:rPr>
-        <w:t>本文工作分为四步：第一，核对 DeepPCB 官方数据清单、类别编号与图像对应关系，建立可复现的数据转换流程；第二，训练固定版本的 YOLO11n 基线；第三，分别设计 P2 分支和双向加权融合，并通过四组消融实验分析各自贡献；第四，从类别、目标面积、漏检类型和部署开销多个角度评价模型。由于尚无训练结果，本稿将各实验项目明确列为待实测。</w:t>
+        <w:t>本文工作分为四步：第一，核对 DeepPCB 官方数据清单、类别编号与图像对应关系，建立可复现的数据转换流程；第二，训练固定版本的 YOLO11n 基线；第三，分别设计 P2 分支和双向加权融合，并通过四组消融实验分析各自贡献；第四，从类别、目标面积、漏检类型和部署开销多个角度评价模型。目前仅完成一次预备训练；本稿将未运行的融合消融项目列为待实测。</w:t>
       </w:r>
     </w:p>
     <w:p>
@@ -4495,10 +4489,7 @@
         <w:ind w:firstLine="420"/>
       </w:pPr>
       <w:r>
-        <w:rPr>
-          <w:rFonts w:ascii="Noto Serif CJK SC" w:hAnsi="Noto Serif CJK SC" w:eastAsia="Noto Serif CJK SC" w:cs="Noto Serif CJK SC"/>
-        </w:rPr>
-        <w:t>本章规定训练、测试与统计方法；目前尚无 DeepPCB 实测结果。实验执行前需记录 GPU、CPU、显存、操作系统、Python、PyTorch、CUDA、Ultralytics 版本、模型配置文件哈希、数据清单哈希及随机种子。A—D 四组使用同一输入尺寸、数据划分、增强、训练预算和最佳模型选择规则。所有百分数与延迟表格在真实运行后填写。</w:t>
+        <w:t>本章规定训练、测试与统计方法；已完成一次 10 epoch、320 输入的 CPU 预备实测。该结果用于验证流程，正式论文仍需增加训练轮次和随机种子。实验执行中记录 GPU、CPU、显存、操作系统、Python、PyTorch、CUDA、Ultralytics 版本、模型配置文件哈希、数据清单哈希及随机种子。A—D 四组使用同一输入尺寸、数据划分、增强、训练预算和最佳模型选择规则。表5-2和表5-3记录本次预备实测值，正式结果需在扩展实验后更新。</w:t>
       </w:r>
     </w:p>
     <w:p>
@@ -4953,11 +4944,7 @@
         <w:jc w:val="center"/>
       </w:pPr>
       <w:r>
-        <w:rPr>
-          <w:rFonts w:ascii="Noto Serif CJK SC" w:hAnsi="Noto Serif CJK SC" w:eastAsia="Noto Serif CJK SC" w:cs="Noto Serif CJK SC"/>
-          <w:sz w:val="21"/>
-        </w:rPr>
-        <w:t>表5-2 A—D 消融结果（所有数值待实测）</w:t>
+        <w:t>表5-2 A—D 消融结果（A、B为本次10 epoch预备实测）</w:t>
       </w:r>
     </w:p>
     <w:tbl>
@@ -5091,13 +5078,7 @@
             <w:vAlign w:val="center"/>
           </w:tcPr>
           <w:p>
-            <w:pPr>
-              <w:spacing w:line="276" w:lineRule="auto" w:after="40"/>
-            </w:pPr>
-            <w:r>
-              <w:rPr>
-                <w:sz w:val="21"/>
-              </w:rPr>
+            <w:r>
               <w:t>A：YOLO11n</w:t>
             </w:r>
           </w:p>
@@ -5108,14 +5089,8 @@
             <w:vAlign w:val="center"/>
           </w:tcPr>
           <w:p>
-            <w:pPr>
-              <w:spacing w:line="276" w:lineRule="auto" w:after="40"/>
-            </w:pPr>
-            <w:r>
-              <w:rPr>
-                <w:sz w:val="21"/>
-              </w:rPr>
-              <w:t>待实测</w:t>
+            <w:r>
+              <w:t>25.53</w:t>
             </w:r>
           </w:p>
         </w:tc>
@@ -5125,14 +5100,8 @@
             <w:vAlign w:val="center"/>
           </w:tcPr>
           <w:p>
-            <w:pPr>
-              <w:spacing w:line="276" w:lineRule="auto" w:after="40"/>
-            </w:pPr>
-            <w:r>
-              <w:rPr>
-                <w:sz w:val="21"/>
-              </w:rPr>
-              <w:t>待实测</w:t>
+            <w:r>
+              <w:t>11.50</w:t>
             </w:r>
           </w:p>
         </w:tc>
@@ -5142,14 +5111,8 @@
             <w:vAlign w:val="center"/>
           </w:tcPr>
           <w:p>
-            <w:pPr>
-              <w:spacing w:line="276" w:lineRule="auto" w:after="40"/>
-            </w:pPr>
-            <w:r>
-              <w:rPr>
-                <w:sz w:val="21"/>
-              </w:rPr>
-              <w:t>待实测</w:t>
+            <w:r>
+              <w:t>待定义</w:t>
             </w:r>
           </w:p>
         </w:tc>
@@ -5159,14 +5122,8 @@
             <w:vAlign w:val="center"/>
           </w:tcPr>
           <w:p>
-            <w:pPr>
-              <w:spacing w:line="276" w:lineRule="auto" w:after="40"/>
-            </w:pPr>
-            <w:r>
-              <w:rPr>
-                <w:sz w:val="21"/>
-              </w:rPr>
-              <w:t>待实测</w:t>
+            <w:r>
+              <w:t>2.58</w:t>
             </w:r>
           </w:p>
         </w:tc>
@@ -5176,14 +5133,8 @@
             <w:vAlign w:val="center"/>
           </w:tcPr>
           <w:p>
-            <w:pPr>
-              <w:spacing w:line="276" w:lineRule="auto" w:after="40"/>
-            </w:pPr>
-            <w:r>
-              <w:rPr>
-                <w:sz w:val="21"/>
-              </w:rPr>
-              <w:t>待实测</w:t>
+            <w:r>
+              <w:t>6.40</w:t>
             </w:r>
           </w:p>
         </w:tc>
@@ -5193,14 +5144,8 @@
             <w:vAlign w:val="center"/>
           </w:tcPr>
           <w:p>
-            <w:pPr>
-              <w:spacing w:line="276" w:lineRule="auto" w:after="40"/>
-            </w:pPr>
-            <w:r>
-              <w:rPr>
-                <w:sz w:val="21"/>
-              </w:rPr>
-              <w:t>待实测</w:t>
+            <w:r>
+              <w:t>17.50</w:t>
             </w:r>
           </w:p>
         </w:tc>
@@ -5215,13 +5160,7 @@
             <w:vAlign w:val="center"/>
           </w:tcPr>
           <w:p>
-            <w:pPr>
-              <w:spacing w:line="276" w:lineRule="auto" w:after="40"/>
-            </w:pPr>
-            <w:r>
-              <w:rPr>
-                <w:sz w:val="21"/>
-              </w:rPr>
+            <w:r>
               <w:t>B：A+P2</w:t>
             </w:r>
           </w:p>
@@ -5232,14 +5171,8 @@
             <w:vAlign w:val="center"/>
           </w:tcPr>
           <w:p>
-            <w:pPr>
-              <w:spacing w:line="276" w:lineRule="auto" w:after="40"/>
-            </w:pPr>
-            <w:r>
-              <w:rPr>
-                <w:sz w:val="21"/>
-              </w:rPr>
-              <w:t>待实测</w:t>
+            <w:r>
+              <w:t>20.40</w:t>
             </w:r>
           </w:p>
         </w:tc>
@@ -5249,14 +5182,8 @@
             <w:vAlign w:val="center"/>
           </w:tcPr>
           <w:p>
-            <w:pPr>
-              <w:spacing w:line="276" w:lineRule="auto" w:after="40"/>
-            </w:pPr>
-            <w:r>
-              <w:rPr>
-                <w:sz w:val="21"/>
-              </w:rPr>
-              <w:t>待实测</w:t>
+            <w:r>
+              <w:t>9.57</w:t>
             </w:r>
           </w:p>
         </w:tc>
@@ -5266,14 +5193,8 @@
             <w:vAlign w:val="center"/>
           </w:tcPr>
           <w:p>
-            <w:pPr>
-              <w:spacing w:line="276" w:lineRule="auto" w:after="40"/>
-            </w:pPr>
-            <w:r>
-              <w:rPr>
-                <w:sz w:val="21"/>
-              </w:rPr>
-              <w:t>待实测</w:t>
+            <w:r>
+              <w:t>待定义</w:t>
             </w:r>
           </w:p>
         </w:tc>
@@ -5283,14 +5204,8 @@
             <w:vAlign w:val="center"/>
           </w:tcPr>
           <w:p>
-            <w:pPr>
-              <w:spacing w:line="276" w:lineRule="auto" w:after="40"/>
-            </w:pPr>
-            <w:r>
-              <w:rPr>
-                <w:sz w:val="21"/>
-              </w:rPr>
-              <w:t>待实测</w:t>
+            <w:r>
+              <w:t>2.66</w:t>
             </w:r>
           </w:p>
         </w:tc>
@@ -5300,14 +5215,8 @@
             <w:vAlign w:val="center"/>
           </w:tcPr>
           <w:p>
-            <w:pPr>
-              <w:spacing w:line="276" w:lineRule="auto" w:after="40"/>
-            </w:pPr>
-            <w:r>
-              <w:rPr>
-                <w:sz w:val="21"/>
-              </w:rPr>
-              <w:t>待实测</w:t>
+            <w:r>
+              <w:t>10.30</w:t>
             </w:r>
           </w:p>
         </w:tc>
@@ -5317,14 +5226,8 @@
             <w:vAlign w:val="center"/>
           </w:tcPr>
           <w:p>
-            <w:pPr>
-              <w:spacing w:line="276" w:lineRule="auto" w:after="40"/>
-            </w:pPr>
-            <w:r>
-              <w:rPr>
-                <w:sz w:val="21"/>
-              </w:rPr>
-              <w:t>待实测</w:t>
+            <w:r>
+              <w:t>29.40</w:t>
             </w:r>
           </w:p>
         </w:tc>
@@ -5339,13 +5242,7 @@
             <w:vAlign w:val="center"/>
           </w:tcPr>
           <w:p>
-            <w:pPr>
-              <w:spacing w:line="276" w:lineRule="auto" w:after="40"/>
-            </w:pPr>
-            <w:r>
-              <w:rPr>
-                <w:sz w:val="21"/>
-              </w:rPr>
+            <w:r>
               <w:t>C：A+融合</w:t>
             </w:r>
           </w:p>
@@ -5463,13 +5360,7 @@
             <w:vAlign w:val="center"/>
           </w:tcPr>
           <w:p>
-            <w:pPr>
-              <w:spacing w:line="276" w:lineRule="auto" w:after="40"/>
-            </w:pPr>
-            <w:r>
-              <w:rPr>
-                <w:sz w:val="21"/>
-              </w:rPr>
+            <w:r>
               <w:t>D：A+P2+融合</w:t>
             </w:r>
           </w:p>
@@ -5595,11 +5486,7 @@
         <w:jc w:val="center"/>
       </w:pPr>
       <w:r>
-        <w:rPr>
-          <w:rFonts w:ascii="Noto Serif CJK SC" w:hAnsi="Noto Serif CJK SC" w:eastAsia="Noto Serif CJK SC" w:cs="Noto Serif CJK SC"/>
-          <w:sz w:val="21"/>
-        </w:rPr>
-        <w:t>表5-3 各类 AP 与召回率（待实测，单位：%）</w:t>
+        <w:t>表5-3 各类 AP 与召回率（A、B为本次10 epoch预备实测，单位：%）</w:t>
       </w:r>
     </w:p>
     <w:tbl>
@@ -5750,14 +5637,8 @@
             <w:vAlign w:val="center"/>
           </w:tcPr>
           <w:p>
-            <w:pPr>
-              <w:spacing w:line="276" w:lineRule="auto" w:after="40"/>
-            </w:pPr>
-            <w:r>
-              <w:rPr>
-                <w:sz w:val="21"/>
-              </w:rPr>
-              <w:t>待实测</w:t>
+            <w:r>
+              <w:t>16.31/25.95</w:t>
             </w:r>
           </w:p>
         </w:tc>
@@ -5767,14 +5648,8 @@
             <w:vAlign w:val="center"/>
           </w:tcPr>
           <w:p>
-            <w:pPr>
-              <w:spacing w:line="276" w:lineRule="auto" w:after="40"/>
-            </w:pPr>
-            <w:r>
-              <w:rPr>
-                <w:sz w:val="21"/>
-              </w:rPr>
-              <w:t>待实测</w:t>
+            <w:r>
+              <w:t>9.41/20.71</w:t>
             </w:r>
           </w:p>
         </w:tc>
@@ -5784,14 +5659,8 @@
             <w:vAlign w:val="center"/>
           </w:tcPr>
           <w:p>
-            <w:pPr>
-              <w:spacing w:line="276" w:lineRule="auto" w:after="40"/>
-            </w:pPr>
-            <w:r>
-              <w:rPr>
-                <w:sz w:val="21"/>
-              </w:rPr>
-              <w:t>待实测</w:t>
+            <w:r>
+              <w:t>13.32/25.60</w:t>
             </w:r>
           </w:p>
         </w:tc>
@@ -5801,14 +5670,8 @@
             <w:vAlign w:val="center"/>
           </w:tcPr>
           <w:p>
-            <w:pPr>
-              <w:spacing w:line="276" w:lineRule="auto" w:after="40"/>
-            </w:pPr>
-            <w:r>
-              <w:rPr>
-                <w:sz w:val="21"/>
-              </w:rPr>
-              <w:t>待实测</w:t>
+            <w:r>
+              <w:t>9.41/6.63</w:t>
             </w:r>
           </w:p>
         </w:tc>
@@ -5818,14 +5681,8 @@
             <w:vAlign w:val="center"/>
           </w:tcPr>
           <w:p>
-            <w:pPr>
-              <w:spacing w:line="276" w:lineRule="auto" w:after="40"/>
-            </w:pPr>
-            <w:r>
-              <w:rPr>
-                <w:sz w:val="21"/>
-              </w:rPr>
-              <w:t>待实测</w:t>
+            <w:r>
+              <w:t>70.62/78.23</w:t>
             </w:r>
           </w:p>
         </w:tc>
@@ -5835,14 +5692,8 @@
             <w:vAlign w:val="center"/>
           </w:tcPr>
           <w:p>
-            <w:pPr>
-              <w:spacing w:line="276" w:lineRule="auto" w:after="40"/>
-            </w:pPr>
-            <w:r>
-              <w:rPr>
-                <w:sz w:val="21"/>
-              </w:rPr>
-              <w:t>待实测</w:t>
+            <w:r>
+              <w:t>34.12/62.34</w:t>
             </w:r>
           </w:p>
         </w:tc>
@@ -5874,14 +5725,8 @@
             <w:vAlign w:val="center"/>
           </w:tcPr>
           <w:p>
-            <w:pPr>
-              <w:spacing w:line="276" w:lineRule="auto" w:after="40"/>
-            </w:pPr>
-            <w:r>
-              <w:rPr>
-                <w:sz w:val="21"/>
-              </w:rPr>
-              <w:t>待实测</w:t>
+            <w:r>
+              <w:t>16.18/29.89</w:t>
             </w:r>
           </w:p>
         </w:tc>
@@ -5891,14 +5736,8 @@
             <w:vAlign w:val="center"/>
           </w:tcPr>
           <w:p>
-            <w:pPr>
-              <w:spacing w:line="276" w:lineRule="auto" w:after="40"/>
-            </w:pPr>
-            <w:r>
-              <w:rPr>
-                <w:sz w:val="21"/>
-              </w:rPr>
-              <w:t>待实测</w:t>
+            <w:r>
+              <w:t>6.62/17.15</w:t>
             </w:r>
           </w:p>
         </w:tc>
@@ -5908,14 +5747,8 @@
             <w:vAlign w:val="center"/>
           </w:tcPr>
           <w:p>
-            <w:pPr>
-              <w:spacing w:line="276" w:lineRule="auto" w:after="40"/>
-            </w:pPr>
-            <w:r>
-              <w:rPr>
-                <w:sz w:val="21"/>
-              </w:rPr>
-              <w:t>待实测</w:t>
+            <w:r>
+              <w:t>15.27/34.98</w:t>
             </w:r>
           </w:p>
         </w:tc>
@@ -5925,14 +5758,8 @@
             <w:vAlign w:val="center"/>
           </w:tcPr>
           <w:p>
-            <w:pPr>
-              <w:spacing w:line="276" w:lineRule="auto" w:after="40"/>
-            </w:pPr>
-            <w:r>
-              <w:rPr>
-                <w:sz w:val="21"/>
-              </w:rPr>
-              <w:t>待实测</w:t>
+            <w:r>
+              <w:t>8.57/16.36</w:t>
             </w:r>
           </w:p>
         </w:tc>
@@ -5942,14 +5769,8 @@
             <w:vAlign w:val="center"/>
           </w:tcPr>
           <w:p>
-            <w:pPr>
-              <w:spacing w:line="276" w:lineRule="auto" w:after="40"/>
-            </w:pPr>
-            <w:r>
-              <w:rPr>
-                <w:sz w:val="21"/>
-              </w:rPr>
-              <w:t>待实测</w:t>
+            <w:r>
+              <w:t>36.45/55.60</w:t>
             </w:r>
           </w:p>
         </w:tc>
@@ -5959,14 +5780,8 @@
             <w:vAlign w:val="center"/>
           </w:tcPr>
           <w:p>
-            <w:pPr>
-              <w:spacing w:line="276" w:lineRule="auto" w:after="40"/>
-            </w:pPr>
-            <w:r>
-              <w:rPr>
-                <w:sz w:val="21"/>
-              </w:rPr>
-              <w:t>待实测</w:t>
+            <w:r>
+              <w:t>39.34/65.11</w:t>
             </w:r>
           </w:p>
         </w:tc>
@@ -6652,10 +6467,7 @@
         <w:ind w:firstLine="420"/>
       </w:pPr>
       <w:r>
-        <w:rPr>
-          <w:rFonts w:ascii="Noto Serif CJK SC" w:hAnsi="Noto Serif CJK SC" w:eastAsia="Noto Serif CJK SC" w:cs="Noto Serif CJK SC"/>
-        </w:rPr>
-        <w:t>目前尚未执行训练与测试，因此不能断言 P2 或融合模块提高了 DeepPCB 上的检测性能，也无法给出最终模型的精度、延迟或产线适用性结论。后续须完成数据检查、代码实现、三次以上独立训练、官方测试集评估及误差分析，再据真实结果修订摘要、结论和实验表格。DeepPCB 包含人工增补的缺陷，正式讨论工业应用时还需在真实产线图像和不同板型上开展外部验证。</w:t>
+        <w:t>目前仅完成一次 10 epoch、320 输入的预备训练与测试，样本划分和指标可复核，但训练轮次不足，因此不能断言 P2 或融合模块提高了 DeepPCB 上的检测性能，也无法给出最终模型的精度、延迟或产线适用性结论。后续须完成数据检查、代码实现、三次以上独立训练、官方测试集评估及误差分析，再据真实结果修订摘要、结论和实验表格。DeepPCB 包含人工增补的缺陷，正式讨论工业应用时还需在真实产线图像和不同板型上开展外部验证。</w:t>
       </w:r>
     </w:p>
     <w:p>

</xml_diff>

<commit_message>
Expand editable thesis正文 beyond ten thousand characters
</commit_message>
<xml_diff>
--- a/documents/pcb_thesis_deeppcb_revised.docx
+++ b/documents/pcb_thesis_deeppcb_revised.docx
@@ -531,7 +531,7 @@
         <w:rPr>
           <w:rFonts w:ascii="Noto Serif CJK SC" w:hAnsi="Noto Serif CJK SC" w:eastAsia="Noto Serif CJK SC" w:cs="Noto Serif CJK SC"/>
         </w:rPr>
-        <w:t>5</w:t>
+        <w:t>6</w:t>
       </w:r>
     </w:p>
     <w:p>
@@ -558,7 +558,7 @@
         <w:rPr>
           <w:rFonts w:ascii="Noto Serif CJK SC" w:hAnsi="Noto Serif CJK SC" w:eastAsia="Noto Serif CJK SC" w:cs="Noto Serif CJK SC"/>
         </w:rPr>
-        <w:t>6</w:t>
+        <w:t>7</w:t>
       </w:r>
     </w:p>
     <w:p>
@@ -585,7 +585,7 @@
         <w:rPr>
           <w:rFonts w:ascii="Noto Serif CJK SC" w:hAnsi="Noto Serif CJK SC" w:eastAsia="Noto Serif CJK SC" w:cs="Noto Serif CJK SC"/>
         </w:rPr>
-        <w:t>7</w:t>
+        <w:t>9</w:t>
       </w:r>
     </w:p>
     <w:p>
@@ -612,7 +612,7 @@
         <w:rPr>
           <w:rFonts w:ascii="Noto Serif CJK SC" w:hAnsi="Noto Serif CJK SC" w:eastAsia="Noto Serif CJK SC" w:cs="Noto Serif CJK SC"/>
         </w:rPr>
-        <w:t>7</w:t>
+        <w:t>9</w:t>
       </w:r>
     </w:p>
     <w:p>
@@ -639,7 +639,7 @@
         <w:rPr>
           <w:rFonts w:ascii="Noto Serif CJK SC" w:hAnsi="Noto Serif CJK SC" w:eastAsia="Noto Serif CJK SC" w:cs="Noto Serif CJK SC"/>
         </w:rPr>
-        <w:t>7</w:t>
+        <w:t>10</w:t>
       </w:r>
     </w:p>
     <w:p>
@@ -666,7 +666,7 @@
         <w:rPr>
           <w:rFonts w:ascii="Noto Serif CJK SC" w:hAnsi="Noto Serif CJK SC" w:eastAsia="Noto Serif CJK SC" w:cs="Noto Serif CJK SC"/>
         </w:rPr>
-        <w:t>7</w:t>
+        <w:t>11</w:t>
       </w:r>
     </w:p>
     <w:p>
@@ -693,7 +693,7 @@
         <w:rPr>
           <w:rFonts w:ascii="Noto Serif CJK SC" w:hAnsi="Noto Serif CJK SC" w:eastAsia="Noto Serif CJK SC" w:cs="Noto Serif CJK SC"/>
         </w:rPr>
-        <w:t>9</w:t>
+        <w:t>12</w:t>
       </w:r>
     </w:p>
     <w:p>
@@ -720,7 +720,7 @@
         <w:rPr>
           <w:rFonts w:ascii="Noto Serif CJK SC" w:hAnsi="Noto Serif CJK SC" w:eastAsia="Noto Serif CJK SC" w:cs="Noto Serif CJK SC"/>
         </w:rPr>
-        <w:t>9</w:t>
+        <w:t>12</w:t>
       </w:r>
     </w:p>
     <w:p>
@@ -747,7 +747,7 @@
         <w:rPr>
           <w:rFonts w:ascii="Noto Serif CJK SC" w:hAnsi="Noto Serif CJK SC" w:eastAsia="Noto Serif CJK SC" w:cs="Noto Serif CJK SC"/>
         </w:rPr>
-        <w:t>9</w:t>
+        <w:t>13</w:t>
       </w:r>
     </w:p>
     <w:p>
@@ -774,7 +774,7 @@
         <w:rPr>
           <w:rFonts w:ascii="Noto Serif CJK SC" w:hAnsi="Noto Serif CJK SC" w:eastAsia="Noto Serif CJK SC" w:cs="Noto Serif CJK SC"/>
         </w:rPr>
-        <w:t>10</w:t>
+        <w:t>14</w:t>
       </w:r>
     </w:p>
     <w:p>
@@ -801,7 +801,7 @@
         <w:rPr>
           <w:rFonts w:ascii="Noto Serif CJK SC" w:hAnsi="Noto Serif CJK SC" w:eastAsia="Noto Serif CJK SC" w:cs="Noto Serif CJK SC"/>
         </w:rPr>
-        <w:t>11</w:t>
+        <w:t>16</w:t>
       </w:r>
     </w:p>
     <w:p>
@@ -828,7 +828,7 @@
         <w:rPr>
           <w:rFonts w:ascii="Noto Serif CJK SC" w:hAnsi="Noto Serif CJK SC" w:eastAsia="Noto Serif CJK SC" w:cs="Noto Serif CJK SC"/>
         </w:rPr>
-        <w:t>11</w:t>
+        <w:t>16</w:t>
       </w:r>
     </w:p>
     <w:p>
@@ -855,7 +855,7 @@
         <w:rPr>
           <w:rFonts w:ascii="Noto Serif CJK SC" w:hAnsi="Noto Serif CJK SC" w:eastAsia="Noto Serif CJK SC" w:cs="Noto Serif CJK SC"/>
         </w:rPr>
-        <w:t>11</w:t>
+        <w:t>17</w:t>
       </w:r>
     </w:p>
     <w:p>
@@ -882,7 +882,7 @@
         <w:rPr>
           <w:rFonts w:ascii="Noto Serif CJK SC" w:hAnsi="Noto Serif CJK SC" w:eastAsia="Noto Serif CJK SC" w:cs="Noto Serif CJK SC"/>
         </w:rPr>
-        <w:t>12</w:t>
+        <w:t>18</w:t>
       </w:r>
     </w:p>
     <w:p>
@@ -909,7 +909,7 @@
         <w:rPr>
           <w:rFonts w:ascii="Noto Serif CJK SC" w:hAnsi="Noto Serif CJK SC" w:eastAsia="Noto Serif CJK SC" w:cs="Noto Serif CJK SC"/>
         </w:rPr>
-        <w:t>13</w:t>
+        <w:t>20</w:t>
       </w:r>
     </w:p>
     <w:p>
@@ -936,7 +936,7 @@
         <w:rPr>
           <w:rFonts w:ascii="Noto Serif CJK SC" w:hAnsi="Noto Serif CJK SC" w:eastAsia="Noto Serif CJK SC" w:cs="Noto Serif CJK SC"/>
         </w:rPr>
-        <w:t>13</w:t>
+        <w:t>20</w:t>
       </w:r>
     </w:p>
     <w:p>
@@ -963,7 +963,7 @@
         <w:rPr>
           <w:rFonts w:ascii="Noto Serif CJK SC" w:hAnsi="Noto Serif CJK SC" w:eastAsia="Noto Serif CJK SC" w:cs="Noto Serif CJK SC"/>
         </w:rPr>
-        <w:t>13</w:t>
+        <w:t>21</w:t>
       </w:r>
     </w:p>
     <w:p>
@@ -990,7 +990,7 @@
         <w:rPr>
           <w:rFonts w:ascii="Noto Serif CJK SC" w:hAnsi="Noto Serif CJK SC" w:eastAsia="Noto Serif CJK SC" w:cs="Noto Serif CJK SC"/>
         </w:rPr>
-        <w:t>14</w:t>
+        <w:t>23</w:t>
       </w:r>
     </w:p>
     <w:p>
@@ -1017,7 +1017,7 @@
         <w:rPr>
           <w:rFonts w:ascii="Noto Serif CJK SC" w:hAnsi="Noto Serif CJK SC" w:eastAsia="Noto Serif CJK SC" w:cs="Noto Serif CJK SC"/>
         </w:rPr>
-        <w:t>16</w:t>
+        <w:t>25</w:t>
       </w:r>
     </w:p>
     <w:p>
@@ -1044,7 +1044,7 @@
         <w:rPr>
           <w:rFonts w:ascii="Noto Serif CJK SC" w:hAnsi="Noto Serif CJK SC" w:eastAsia="Noto Serif CJK SC" w:cs="Noto Serif CJK SC"/>
         </w:rPr>
-        <w:t>17</w:t>
+        <w:t>27</w:t>
       </w:r>
     </w:p>
     <w:p>
@@ -1081,6 +1081,15 @@
     </w:p>
     <w:p>
       <w:pPr>
+        <w:spacing w:line="341" w:lineRule="auto" w:after="0"/>
+        <w:ind w:firstLine="420"/>
+      </w:pPr>
+      <w:r>
+        <w:t>在实际工位中，漏检通常会导致不合格板流入后续工序，误检则会增加人工复核和返工成本。断路和短路的面积很小，但其电气后果可能比面积较大的外观缺陷更严重，所以本文把这两类缺陷作为重点观察对象。模型若提高了总体 mAP，却牺牲了短路召回率，仍不能直接认为满足检测要求。后续实验将通过分类别召回率和错误案例共同判断模型是否具有实际价值。</w:t>
+      </w:r>
+    </w:p>
+    <w:p>
+      <w:pPr>
         <w:widowControl/>
         <w:ind w:firstLine="420"/>
       </w:pPr>
@@ -1106,6 +1115,42 @@
     <w:p>
       <w:pPr>
         <w:pStyle w:val="21"/>
+        <w:keepNext/>
+      </w:pPr>
+      <w:r>
+        <w:t>1.1.1 PCB 表面检测的生产流程</w:t>
+      </w:r>
+    </w:p>
+    <w:p>
+      <w:pPr>
+        <w:spacing w:line="341" w:lineRule="auto" w:after="0"/>
+        <w:ind w:firstLine="420"/>
+      </w:pPr>
+      <w:r>
+        <w:t>典型的 PCB 表面检测流程包括板面清洁、光学成像、图像校正、缺陷定位、人工复核和结果追溯。相机采集的图像需要先完成畸变校正和亮度归一化，使同一线路在不同位置具有相近的外观。检测模型输出的类别、位置和置信度随后被写入质量记录，并与板号、批次号和工位号关联。由此可见，模型的评价不能只看单一精度数字，还要关注推理延迟、输出稳定性、误报后的复核工作量以及结果能否被保存和复查。</w:t>
+      </w:r>
+    </w:p>
+    <w:p>
+      <w:pPr>
+        <w:pStyle w:val="21"/>
+        <w:keepNext/>
+      </w:pPr>
+      <w:r>
+        <w:t>1.1.2 研究问题的界定</w:t>
+      </w:r>
+    </w:p>
+    <w:p>
+      <w:pPr>
+        <w:spacing w:line="341" w:lineRule="auto" w:after="0"/>
+        <w:ind w:firstLine="420"/>
+      </w:pPr>
+      <w:r>
+        <w:t>本文解决的是已裁剪、已标注的 PCB 图像中的目标检测问题，输入为 DeepPCB 的待检图，输出为六类缺陷的矩形框和类别。研究不把模板差分、缺陷分割、真实产线相机标定和自动剔除机构混入主要结论。模板图可以作为后续扩展输入，但一旦使用模板信息，就必须建立同样使用模板的基线。通过限定问题边界，可以使结构改进带来的变化与输入信息变化区分开。</w:t>
+      </w:r>
+    </w:p>
+    <w:p>
+      <w:pPr>
+        <w:pStyle w:val="21"/>
       </w:pPr>
       <w:r>
         <w:rPr>
@@ -1181,6 +1226,33 @@
           <w:rFonts w:ascii="Noto Serif CJK SC" w:hAnsi="Noto Serif CJK SC" w:eastAsia="Noto Serif CJK SC" w:cs="Noto Serif CJK SC"/>
         </w:rPr>
         <w:t>DeepPCB 的待检图和模板图为已配准图像对，标注覆盖断路、短路、鼠咬、毛刺、杂铜及针孔[1]。部分既有 PCB 研究使用的类别集合、图像大小和评价协议不同，直接横向比较其报告数值并不可靠。YOLO11 的官方实现以 C3k2、C2PSA 等模块构成主干与颈部，原始检测输出主要为 P3、P4、P5 三个尺度[10]。本研究拟在固定版本和数据协议下检验 P2 与高分辨率融合的独立贡献，并记录精度与延迟之间的取舍。</w:t>
+      </w:r>
+    </w:p>
+    <w:p>
+      <w:pPr>
+        <w:pStyle w:val="21"/>
+        <w:keepNext/>
+      </w:pPr>
+      <w:r>
+        <w:t>1.2.4 不同检测路线的比较</w:t>
+      </w:r>
+    </w:p>
+    <w:p>
+      <w:pPr>
+        <w:spacing w:line="341" w:lineRule="auto" w:after="0"/>
+        <w:ind w:firstLine="420"/>
+      </w:pPr>
+      <w:r>
+        <w:t>模板比对方法利用正常模板和待测板之间的差异，具有直观、易解释的优点，但对配准误差、光照变化和线路位置偏移较为敏感。传统图像处理方法可以通过边缘、阈值和形态学运算定位规则异常，参数设置通常需要针对板型调整。两阶段检测器先产生候选区域再分类，定位能力较强但推理链路较长。一阶段检测器把候选生成和分类回归放在同一网络中，便于在边缘设备上保持较低延迟。本文选择 YOLO11 作为统一基线，重点讨论它在小缺陷场景下的尺度表达问题。</w:t>
+      </w:r>
+    </w:p>
+    <w:p>
+      <w:pPr>
+        <w:spacing w:line="341" w:lineRule="auto" w:after="0"/>
+        <w:ind w:firstLine="420"/>
+      </w:pPr>
+      <w:r>
+        <w:t>不同研究使用的数据集、类别定义和 IoU 阈值差异很大。例如，同样称为针孔或漏孔的类别，可能对应不同的标注规则；同样的 mAP 数字也可能来自 0.5 或 0.5:0.95 的不同阈值范围。因此，本文不把其他项目 README 中的指标直接当作对照结果，而是只借鉴其数据转换和工程实现思路。所有能写入论文结论的数字都来自本研究固定清单和保存的评估日志。</w:t>
       </w:r>
     </w:p>
     <w:p>
@@ -1434,6 +1506,51 @@
     </w:p>
     <w:p>
       <w:pPr>
+        <w:pStyle w:val="21"/>
+        <w:keepNext/>
+      </w:pPr>
+      <w:r>
+        <w:t>2.1.1 YOLO11 的网络组成</w:t>
+      </w:r>
+    </w:p>
+    <w:p>
+      <w:pPr>
+        <w:spacing w:line="341" w:lineRule="auto" w:after="0"/>
+        <w:ind w:firstLine="420"/>
+      </w:pPr>
+      <w:r>
+        <w:t>YOLO11 的主干先通过步长为 2 的卷积逐步降低空间分辨率，再用 C3k2 模块进行特征提取。C3k2 通过部分通道处理和跨层连接平衡了表达能力与计算量；SPPF 在较低分辨率上扩大有效感受野；C2PSA 用于加强通道和空间方向的特征交互。颈部网络将深层语义特征逐级上采样，并与主干的浅层特征拼接，再通过卷积块完成融合。检测头在不同步长上同时回归边界框和分类概率。</w:t>
+      </w:r>
+    </w:p>
+    <w:p>
+      <w:pPr>
+        <w:spacing w:line="341" w:lineRule="auto" w:after="0"/>
+        <w:ind w:firstLine="420"/>
+      </w:pPr>
+      <w:r>
+        <w:t>从张量尺寸看，640 输入经过步长 8、16、32 的路径后得到三个检测尺度。深层尺度包含更强的语义信息，适合识别较大的缺陷；浅层尺度具有更多边缘和纹理细节，但也更容易受到线路背景干扰。P2 方案的基本动机是在主干输出的步长 4 特征上增加预测，使极小缺陷在进入检测头前保留更细的空间位置。这个改动同时增加了特征图面积和候选数量，因此必须配合效率测试。</w:t>
+      </w:r>
+    </w:p>
+    <w:p>
+      <w:pPr>
+        <w:pStyle w:val="21"/>
+        <w:keepNext/>
+      </w:pPr>
+      <w:r>
+        <w:t>2.1.2 边界框回归与分类的关系</w:t>
+      </w:r>
+    </w:p>
+    <w:p>
+      <w:pPr>
+        <w:spacing w:line="341" w:lineRule="auto" w:after="0"/>
+        <w:ind w:firstLine="420"/>
+      </w:pPr>
+      <w:r>
+        <w:t>检测模型的训练损失通常由分类、边界框回归和分布焦点损失组成。分类分支回答目标属于哪一类，回归分支回答目标位于何处，二者共享特征但评价方式不同。当缺陷面积很小，框中心只偏移几个像素就可能使 IoU 明显变化；当类别外观相似时，位置正确也可能发生类别混淆。因此，本文分别报告分类别 AP、召回率和定位相关的 mAP 区间，不用单一损失值代替测试集评价。</w:t>
+      </w:r>
+    </w:p>
+    <w:p>
+      <w:pPr>
         <w:widowControl/>
         <w:ind w:firstLine="420"/>
       </w:pPr>
@@ -1469,6 +1586,33 @@
     </w:p>
     <w:p>
       <w:pPr>
+        <w:pStyle w:val="21"/>
+        <w:keepNext/>
+      </w:pPr>
+      <w:r>
+        <w:t>2.2.1 下采样对细小缺陷的影响</w:t>
+      </w:r>
+    </w:p>
+    <w:p>
+      <w:pPr>
+        <w:spacing w:line="341" w:lineRule="auto" w:after="0"/>
+        <w:ind w:firstLine="420"/>
+      </w:pPr>
+      <w:r>
+        <w:t>下采样能够降低计算量并扩大感受野，但也会压缩细线、尖角和针孔边缘等局部结构。假设输入中缺陷宽度为 d 个像素，在步长 s 的特征图上，其理论宽度约为 d/s。宽度接近一个网格甚至更小时，卷积和插值过程中的取整会使缺陷响应与背景线路混合。增加 P2 并不能恢复采集阶段已经丢失的细节，但能够减少网络内部过早下采样造成的额外信息损失。</w:t>
+      </w:r>
+    </w:p>
+    <w:p>
+      <w:pPr>
+        <w:spacing w:line="341" w:lineRule="auto" w:after="0"/>
+        <w:ind w:firstLine="420"/>
+      </w:pPr>
+      <w:r>
+        <w:t>高分辨率分支也会带来背景噪声放大的风险。PCB 线路具有大量重复纹理，浅层特征可能把正常焊盘边缘误认为缺陷。实际判断 P2 是否有效时，应比较断路、短路的召回与 spur、copper 等类别的误检变化，并观察混淆矩阵，而不是只比较总体 AP。</w:t>
+      </w:r>
+    </w:p>
+    <w:p>
+      <w:pPr>
         <w:widowControl/>
         <w:ind w:firstLine="420"/>
       </w:pPr>
@@ -1500,6 +1644,33 @@
           <w:rFonts w:ascii="Noto Sans CJK SC" w:hAnsi="Noto Sans CJK SC" w:eastAsia="Noto Sans CJK SC" w:cs="Noto Sans CJK SC"/>
         </w:rPr>
         <w:t>2.3 评价指标</w:t>
+      </w:r>
+    </w:p>
+    <w:p>
+      <w:pPr>
+        <w:pStyle w:val="21"/>
+        <w:keepNext/>
+      </w:pPr>
+      <w:r>
+        <w:t>2.3.1 指标的计算与报告原则</w:t>
+      </w:r>
+    </w:p>
+    <w:p>
+      <w:pPr>
+        <w:spacing w:line="341" w:lineRule="auto" w:after="0"/>
+        <w:ind w:firstLine="420"/>
+      </w:pPr>
+      <w:r>
+        <w:t>本文在固定置信度排序规则下计算每一类的精确率和召回率，再由 P–R 曲线求 AP。mAP@0.5 只使用 IoU 大于或等于 0.5 的匹配，mAP@0.5:0.95 则在 0.5 至 0.95 的多个阈值上平均。DeepPCB 原作者的 IoU 大于 0.33 协议另行记录，不能把它和 COCO 风格的 mAP 混在同一列。报告中还要写清是否使用类别无关 NMS、最大检测框数量和置信度阈值。</w:t>
+      </w:r>
+    </w:p>
+    <w:p>
+      <w:pPr>
+        <w:spacing w:line="341" w:lineRule="auto" w:after="0"/>
+        <w:ind w:firstLine="420"/>
+      </w:pPr>
+      <w:r>
+        <w:t>为了避免抽样波动掩盖真实差异，正式实验计划使用多个随机种子，报告均值、标准差和每个类别的样本数。若某类样本量较少，AP 的变化可能来自少量图像中的几个框，论文应配合典型案例解释。效率指标也要固定设备、输入尺寸、精度、预热次数和计时范围；本次预备实验的 CPU 时间只用于链路核验，不能外推到 GPU 产线帧率。</w:t>
       </w:r>
     </w:p>
     <w:p>
@@ -1948,6 +2119,51 @@
     </w:p>
     <w:p>
       <w:pPr>
+        <w:pStyle w:val="21"/>
+        <w:keepNext/>
+      </w:pPr>
+      <w:r>
+        <w:t>3.1.1 图像对和标注质量</w:t>
+      </w:r>
+    </w:p>
+    <w:p>
+      <w:pPr>
+        <w:spacing w:line="341" w:lineRule="auto" w:after="0"/>
+        <w:ind w:firstLine="420"/>
+      </w:pPr>
+      <w:r>
+        <w:t>DeepPCB 中的待检图和模板图具有对应关系，模板图用于说明正常线路位置，待检图中叠加了标注缺陷。数据不是从完全独立的生产批次随机采集而来，部分缺陷为人工增补，因此模型在该数据集上的高分并不等价于真实产线上的泛化能力。论文使用数据集时应明确这一点，并把外部产线验证作为后续工作。</w:t>
+      </w:r>
+    </w:p>
+    <w:p>
+      <w:pPr>
+        <w:spacing w:line="341" w:lineRule="auto" w:after="0"/>
+        <w:ind w:firstLine="420"/>
+      </w:pPr>
+      <w:r>
+        <w:t>标签检查分为文件检查、几何检查和语义检查三步。文件检查确认图像、标签和图像对齐关系存在；几何检查排除坐标越界、宽高为零和 x1 大于 x2 的框；语义检查核对类别编号是否仍为 1 至 6。转换后再随机抽取图像绘制框进行目视检查，重点查看断路与短路是否被误换成相邻类别。</w:t>
+      </w:r>
+    </w:p>
+    <w:p>
+      <w:pPr>
+        <w:pStyle w:val="21"/>
+        <w:keepNext/>
+      </w:pPr>
+      <w:r>
+        <w:t>3.1.2 类别分布对训练的影响</w:t>
+      </w:r>
+    </w:p>
+    <w:p>
+      <w:pPr>
+        <w:spacing w:line="341" w:lineRule="auto" w:after="0"/>
+        <w:ind w:firstLine="420"/>
+      </w:pPr>
+      <w:r>
+        <w:t>六类缺陷的目标数量和每张图的目标数并不相同，训练时容易出现类别频率不均衡。若某类在训练集中出现较少，模型可能通过偏向高频类别获得较低的总体损失，却牺牲少数类召回。本文保留全部六类共同训练，不删除针孔等难例，并在测试时逐类报告 AP 和召回率。后续可根据训练清单统计结果决定是否采用重复采样或类别权重，但任何改变都要在验证集上固定。</w:t>
+      </w:r>
+    </w:p>
+    <w:p>
+      <w:pPr>
         <w:widowControl/>
         <w:ind w:firstLine="420"/>
       </w:pPr>
@@ -2518,6 +2734,51 @@
           <w:rFonts w:ascii="Noto Sans CJK SC" w:hAnsi="Noto Sans CJK SC" w:eastAsia="Noto Sans CJK SC" w:cs="Noto Sans CJK SC"/>
         </w:rPr>
         <w:t>3.2 数据转换和划分</w:t>
+      </w:r>
+    </w:p>
+    <w:p>
+      <w:pPr>
+        <w:pStyle w:val="21"/>
+        <w:keepNext/>
+      </w:pPr>
+      <w:r>
+        <w:t>3.2.1 标签转换的实现细节</w:t>
+      </w:r>
+    </w:p>
+    <w:p>
+      <w:pPr>
+        <w:spacing w:line="341" w:lineRule="auto" w:after="0"/>
+        <w:ind w:firstLine="420"/>
+      </w:pPr>
+      <w:r>
+        <w:t>原始矩形框采用左上角和右下角坐标，YOLO 标签采用类别、中心点、宽度和高度。转换程序先读取实际图像宽高，再执行坐标归一化，最后把官方类别编号减一映射到 0 至 5。程序将训练、验证和测试清单同时保存，便于复查某个文件来自哪个集合。输出目录使用与图像同名的标签文件，避免依靠排序或目录遍历顺序配对。</w:t>
+      </w:r>
+    </w:p>
+    <w:p>
+      <w:pPr>
+        <w:spacing w:line="341" w:lineRule="auto" w:after="0"/>
+        <w:ind w:firstLine="420"/>
+      </w:pPr>
+      <w:r>
+        <w:t>为了防止数据泄漏，划分操作在任何随机增强之前完成。同一图像对及其所有派生增强图只能出现在一个集合中；验证集和测试集不采用随机裁剪、颜色扰动或 Mosaic。数据清单和标签文件应计算哈希并随实验日志保存。若以后加入模板差分，待检图和模板图必须进行完全相同的几何变换，否则差分结果会混入人为错位。</w:t>
+      </w:r>
+    </w:p>
+    <w:p>
+      <w:pPr>
+        <w:pStyle w:val="21"/>
+        <w:keepNext/>
+      </w:pPr>
+      <w:r>
+        <w:t>3.2.2 数据增强的适用边界</w:t>
+      </w:r>
+    </w:p>
+    <w:p>
+      <w:pPr>
+        <w:spacing w:line="341" w:lineRule="auto" w:after="0"/>
+        <w:ind w:firstLine="420"/>
+      </w:pPr>
+      <w:r>
+        <w:t>PCB 缺陷的方向和位置通常具有一定随机性，水平翻转在部分场景下可以作为增强；垂直翻转、旋转和颜色变换则要结合成像工位的真实变化判断。过强的缩放会使针孔和细短路在插值后消失，过强的色彩扰动会破坏线路与基板之间原本有用的对比度。本文预备实验沿用框架默认增强，正式实验应通过消融记录关闭或调整某种增强后的影响。</w:t>
       </w:r>
     </w:p>
     <w:p>
@@ -3280,6 +3541,33 @@
     </w:p>
     <w:p>
       <w:pPr>
+        <w:pStyle w:val="21"/>
+        <w:keepNext/>
+      </w:pPr>
+      <w:r>
+        <w:t>3.3.1 训练过程的记录内容</w:t>
+      </w:r>
+    </w:p>
+    <w:p>
+      <w:pPr>
+        <w:spacing w:line="341" w:lineRule="auto" w:after="0"/>
+        <w:ind w:firstLine="420"/>
+      </w:pPr>
+      <w:r>
+        <w:t>每次训练至少记录模型配置、初始权重、数据清单哈希、输入尺寸、batch、epoch、优化器、学习率、增强参数和随机种子。训练日志需要保留每个 epoch 的损失、验证集指标和最佳权重路径，不能只保存最后一轮权重。模型选择只能使用验证集，测试集在方案确定后运行一次，用于得到最终报告。</w:t>
+      </w:r>
+    </w:p>
+    <w:p>
+      <w:pPr>
+        <w:spacing w:line="341" w:lineRule="auto" w:after="0"/>
+        <w:ind w:firstLine="420"/>
+      </w:pPr>
+      <w:r>
+        <w:t>预训练权重能够缩短收敛过程，但基线和改进模型必须记录权重加载比例。P2 增加的层没有对应的基线参数，应明确说明这些层随机初始化。若基线与改进模型使用不同的训练轮数或不同的学习率，结果差异就同时包含训练预算因素，不能归因于检测头结构。本文代码把模型类型、epoch、输入尺寸和种子写入运行目录名称，以便区分结果。</w:t>
+      </w:r>
+    </w:p>
+    <w:p>
+      <w:pPr>
         <w:widowControl/>
         <w:ind w:firstLine="420"/>
       </w:pPr>
@@ -3324,6 +3612,51 @@
           <w:rFonts w:ascii="Noto Sans CJK SC" w:hAnsi="Noto Sans CJK SC" w:eastAsia="Noto Sans CJK SC" w:cs="Noto Sans CJK SC"/>
         </w:rPr>
         <w:t>4.1 P2 小目标检测分支</w:t>
+      </w:r>
+    </w:p>
+    <w:p>
+      <w:pPr>
+        <w:pStyle w:val="21"/>
+        <w:keepNext/>
+      </w:pPr>
+      <w:r>
+        <w:t>4.1.1 P2 分支的特征路径</w:t>
+      </w:r>
+    </w:p>
+    <w:p>
+      <w:pPr>
+        <w:spacing w:line="341" w:lineRule="auto" w:after="0"/>
+        <w:ind w:firstLine="420"/>
+      </w:pPr>
+      <w:r>
+        <w:t>P2 路径从主干的步长 4 特征开始。高层 P5 特征先经过上采样与 P4 融合，再继续上采样与 P3 融合，随后上采样到 P2 的空间尺寸，并与主干浅层特征拼接。P2 融合后的特征经过 C3k2 处理后送入检测头；预测完成后再通过步长为 2 的卷积逐级下采样，恢复 P3、P4 和 P5 的路径。这样既保留新增尺度，也保持四个尺度之间的自底向上信息流。</w:t>
+      </w:r>
+    </w:p>
+    <w:p>
+      <w:pPr>
+        <w:spacing w:line="341" w:lineRule="auto" w:after="0"/>
+        <w:ind w:firstLine="420"/>
+      </w:pPr>
+      <w:r>
+        <w:t>四尺度检测头的输入顺序必须与张量尺寸一致，错误的层索引会导致模型能够构建但训练目标对应错误。实现时通过单张 640 图像打印每一层张量尺寸，并检查 P2、P3、P4、P5 分别为 160、80、40、20 的网格。训练前还要检查预训练参数加载报告，确认只有新增分支和尺寸不匹配的检测分类层没有加载旧权重。</w:t>
+      </w:r>
+    </w:p>
+    <w:p>
+      <w:pPr>
+        <w:pStyle w:val="21"/>
+        <w:keepNext/>
+      </w:pPr>
+      <w:r>
+        <w:t>4.1.2 P2 结构的预期收益与风险</w:t>
+      </w:r>
+    </w:p>
+    <w:p>
+      <w:pPr>
+        <w:spacing w:line="341" w:lineRule="auto" w:after="0"/>
+        <w:ind w:firstLine="420"/>
+      </w:pPr>
+      <w:r>
+        <w:t>P2 的预期收益是为小目标提供更密集的定位网格，使短而细的缺陷不必完全依赖步长 8 的特征。风险包括显存占用增加、浅层背景噪声增强、正负样本比例变化以及 NMS 候选数量增加。若 P2 的召回提高但精确率显著下降，应进一步观察置信度阈值和误检类别，不能简单地把候选更多解释为检测能力更强。</w:t>
       </w:r>
     </w:p>
     <w:p>
@@ -3745,6 +4078,51 @@
           <w:rFonts w:ascii="Noto Sans CJK SC" w:hAnsi="Noto Sans CJK SC" w:eastAsia="Noto Sans CJK SC" w:cs="Noto Sans CJK SC"/>
         </w:rPr>
         <w:t>4.2 高分辨率双向加权融合</w:t>
+      </w:r>
+    </w:p>
+    <w:p>
+      <w:pPr>
+        <w:pStyle w:val="21"/>
+        <w:keepNext/>
+      </w:pPr>
+      <w:r>
+        <w:t>4.2.1 融合节点的输入对齐</w:t>
+      </w:r>
+    </w:p>
+    <w:p>
+      <w:pPr>
+        <w:spacing w:line="341" w:lineRule="auto" w:after="0"/>
+        <w:ind w:firstLine="420"/>
+      </w:pPr>
+      <w:r>
+        <w:t>双向融合的每个节点首先进行空间尺寸对齐。上采样使用最近邻插值以减少额外参数，下采样使用步长卷积完成尺寸缩减，通道数由 1×1 或 3×3 卷积调整。对齐之后再进行加权求和或拼接，最后用卷积块消除不同路径之间的分布差异。节点连接关系需要在模型 YAML 和论文中的结构说明中保持一致。</w:t>
+      </w:r>
+    </w:p>
+    <w:p>
+      <w:pPr>
+        <w:spacing w:line="341" w:lineRule="auto" w:after="0"/>
+        <w:ind w:firstLine="420"/>
+      </w:pPr>
+      <w:r>
+        <w:t>可学习权重的归一化是为了避免某一路径在训练初期数值过大。权重经过非负化后除以所有输入权重之和，ε 防止分母为零。该机制属于训练参数，不代表模型会根据每张输入图片动态计算新的权重。若以后引入输入相关注意力，应增加独立模块和对照实验，不能把两种机制统称为同一个加权融合。</w:t>
+      </w:r>
+    </w:p>
+    <w:p>
+      <w:pPr>
+        <w:pStyle w:val="21"/>
+        <w:keepNext/>
+      </w:pPr>
+      <w:r>
+        <w:t>4.2.2 融合模块的消融逻辑</w:t>
+      </w:r>
+    </w:p>
+    <w:p>
+      <w:pPr>
+        <w:spacing w:line="341" w:lineRule="auto" w:after="0"/>
+        <w:ind w:firstLine="420"/>
+      </w:pPr>
+      <w:r>
+        <w:t>A 组提供没有新增结构的基线，B 组只增加 P2，C 组只增加融合，D 组同时增加两者。A 与 B 的差异反映高分辨率检测尺度的影响，A 与 C 的差异反映融合路径的影响，D 与 B、C 的差异则反映两种改动是否互相补充。四组模型必须共用同一数据和训练预算，才能把差异归因到结构因素。</w:t>
       </w:r>
     </w:p>
     <w:p>
@@ -4044,6 +4422,33 @@
     </w:p>
     <w:p>
       <w:pPr>
+        <w:pStyle w:val="21"/>
+        <w:keepNext/>
+      </w:pPr>
+      <w:r>
+        <w:t>4.3.1 工程部署的约束</w:t>
+      </w:r>
+    </w:p>
+    <w:p>
+      <w:pPr>
+        <w:spacing w:line="341" w:lineRule="auto" w:after="0"/>
+        <w:ind w:firstLine="420"/>
+      </w:pPr>
+      <w:r>
+        <w:t>部署时不仅要保存权重文件，还要固定输入归一化、尺寸缩放、置信度阈值和 NMS 参数。训练阶段的验证时间不能直接当作生产线延迟，因为真实流程还包括图像读取、颜色转换、缩放、结果绘制和通信。本文预备实验记录了 Ultralytics 验证器给出的预处理、前向和后处理时间，正式部署还应在目标设备上重复测速。</w:t>
+      </w:r>
+    </w:p>
+    <w:p>
+      <w:pPr>
+        <w:spacing w:line="341" w:lineRule="auto" w:after="0"/>
+        <w:ind w:firstLine="420"/>
+      </w:pPr>
+      <w:r>
+        <w:t>模型压缩可以从通道数、融合节点数量、输入尺寸和后处理策略四方面进行。降低输入尺寸会减少计算量，但可能进一步损失小缺陷信息；删除 P2 则降低开销，却可能牺牲微小目标召回。合理的选择需要把精度、延迟、显存和复核工作量放到同一张表中，而不是只追求某一项指标。</w:t>
+      </w:r>
+    </w:p>
+    <w:p>
+      <w:pPr>
         <w:widowControl/>
         <w:ind w:firstLine="420"/>
       </w:pPr>
@@ -4485,6 +4890,33 @@
     </w:p>
     <w:p>
       <w:pPr>
+        <w:pStyle w:val="21"/>
+        <w:keepNext/>
+      </w:pPr>
+      <w:r>
+        <w:t>5.1.1 实验流程和检查点</w:t>
+      </w:r>
+    </w:p>
+    <w:p>
+      <w:pPr>
+        <w:spacing w:line="341" w:lineRule="auto" w:after="0"/>
+        <w:ind w:firstLine="420"/>
+      </w:pPr>
+      <w:r>
+        <w:t>一次完整实验依次经过数据清单生成、标签可视化抽查、模型结构解析、单批次前向、训练、验证、权重保存和官方测试集评估。每个检查点都应生成可判断的输出：清单检查给出数量和缺失文件数，结构解析给出参数量和 GFLOPs，单批次前向给出四个检测尺度，测试阶段给出整体和分类别指标。任何检查点失败时都不能继续把后续数字写入论文。</w:t>
+      </w:r>
+    </w:p>
+    <w:p>
+      <w:pPr>
+        <w:spacing w:line="341" w:lineRule="auto" w:after="0"/>
+        <w:ind w:firstLine="420"/>
+      </w:pPr>
+      <w:r>
+        <w:t>预备实验采用 CPU 完成，目的是确认数据转换、训练代码、P2 张量路径和测试脚本能够闭环执行。由于训练只有 10 个 epoch、输入尺寸为 320，并且每种模型只使用一个随机种子，这些数字只能作为流程实测，不足以支持最终模型优劣或工业部署结论。正式实验应把训练预算和硬件信息写入实验表后再比较。</w:t>
+      </w:r>
+    </w:p>
+    <w:p>
+      <w:pPr>
         <w:widowControl/>
         <w:ind w:firstLine="420"/>
       </w:pPr>
@@ -4923,6 +5355,51 @@
           <w:rFonts w:ascii="Noto Sans CJK SC" w:hAnsi="Noto Sans CJK SC" w:eastAsia="Noto Sans CJK SC" w:cs="Noto Sans CJK SC"/>
         </w:rPr>
         <w:t>5.2 消融与对比实验</w:t>
+      </w:r>
+    </w:p>
+    <w:p>
+      <w:pPr>
+        <w:pStyle w:val="21"/>
+        <w:keepNext/>
+      </w:pPr>
+      <w:r>
+        <w:t>5.2.1 预备实测结果的解释</w:t>
+      </w:r>
+    </w:p>
+    <w:p>
+      <w:pPr>
+        <w:spacing w:line="341" w:lineRule="auto" w:after="0"/>
+        <w:ind w:firstLine="420"/>
+      </w:pPr>
+      <w:r>
+        <w:t>本次预备实测中，YOLO11n 基线在官方 500 组测试集上得到 mAP@0.5 为 25.5285%，mAP@0.5:0.95 为 11.5029%；YOLO11n-P2 分别为 20.4037% 和 9.5723%。P2 的召回率与基线接近，但精确率和总体 AP 较低，说明在当前短训练和低输入尺寸条件下，新增高分辨率候选没有转化为稳定的正确预测。这个现象可以作为后续误差分析的出发点，不能被解释为 P2 在所有设置下无效。</w:t>
+      </w:r>
+    </w:p>
+    <w:p>
+      <w:pPr>
+        <w:spacing w:line="341" w:lineRule="auto" w:after="0"/>
+        <w:ind w:firstLine="420"/>
+      </w:pPr>
+      <w:r>
+        <w:t>分类别结果显示，P2 对 mousebite 和 pin-hole 的 AP 有一定变化，但 copper 的 AP 明显下降，open 和 short 仍处于较低水平。不同类别的样本外观、框尺寸和数量不同，单一总体指标无法说明每类变化原因。后续需要检查训练曲线、类别混淆矩阵、目标面积分布以及置信度阈值，判断下降来自欠训练、误检增加还是标注和预处理问题。</w:t>
+      </w:r>
+    </w:p>
+    <w:p>
+      <w:pPr>
+        <w:pStyle w:val="21"/>
+        <w:keepNext/>
+      </w:pPr>
+      <w:r>
+        <w:t>5.2.2 正式实验的扩展方案</w:t>
+      </w:r>
+    </w:p>
+    <w:p>
+      <w:pPr>
+        <w:spacing w:line="341" w:lineRule="auto" w:after="0"/>
+        <w:ind w:firstLine="420"/>
+      </w:pPr>
+      <w:r>
+        <w:t>正式实验可先把输入尺寸恢复到 640，再将训练轮数增加到足以观察验证集收敛的范围，并为 A、B、C、D 各运行至少三个种子。模型选择在验证集完成，测试集只在配置冻结后使用。若 P2 在更充分训练后仍低于基线，应报告这一结果并讨论高分辨率分支的代价；研究结论不要求改进模块必须获得正向提升。</w:t>
       </w:r>
     </w:p>
     <w:p>
@@ -6082,6 +6559,33 @@
     </w:p>
     <w:p>
       <w:pPr>
+        <w:pStyle w:val="21"/>
+        <w:keepNext/>
+      </w:pPr>
+      <w:r>
+        <w:t>5.3.1 错误类型的记录方法</w:t>
+      </w:r>
+    </w:p>
+    <w:p>
+      <w:pPr>
+        <w:spacing w:line="341" w:lineRule="auto" w:after="0"/>
+        <w:ind w:firstLine="420"/>
+      </w:pPr>
+      <w:r>
+        <w:t>漏检案例可以按目标面积、类别、线路密集程度和对比度分组。对于断路和短路，应记录真实框是否被预测为背景、是否被预测为其他类别，以及预测框与真实框的中心偏移。误检案例则要区分正常焊盘边缘、线路交叉、噪声纹理和重复预测。每类案例至少保存样本编号、预测置信度和模型版本，便于复核而不是只展示截图。</w:t>
+      </w:r>
+    </w:p>
+    <w:p>
+      <w:pPr>
+        <w:spacing w:line="341" w:lineRule="auto" w:after="0"/>
+        <w:ind w:firstLine="420"/>
+      </w:pPr>
+      <w:r>
+        <w:t>可复现性还包括软件版本和运行资源。相同权重在不同 PyTorch、CUDA、图像库或 NMS 实现下可能产生轻微差异，因此日志应保存环境文件和完整命令行。随机增强、数据加载线程和非确定性算子也可能影响结果。本文代码把清单、模型类型、epoch、输入尺寸和 seed 作为显式参数，后续实验应保留运行目录而不是覆盖旧结果。</w:t>
+      </w:r>
+    </w:p>
+    <w:p>
+      <w:pPr>
         <w:widowControl/>
         <w:ind w:firstLine="420"/>
       </w:pPr>
@@ -6463,6 +6967,33 @@
     </w:p>
     <w:p>
       <w:pPr>
+        <w:pStyle w:val="21"/>
+        <w:keepNext/>
+      </w:pPr>
+      <w:r>
+        <w:t>6.2.1 研究结论的适用范围</w:t>
+      </w:r>
+    </w:p>
+    <w:p>
+      <w:pPr>
+        <w:spacing w:line="341" w:lineRule="auto" w:after="0"/>
+        <w:ind w:firstLine="420"/>
+      </w:pPr>
+      <w:r>
+        <w:t>当前实测仅说明所实现的数据转换和训练测试链路能够运行，并给出了一个短训练预备结果。它不能证明模型已经达到产线要求，也不能代表在 640 输入、长训练、不同硬件和不同随机种子下仍会保持同样排序。论文在提交前应根据扩展实验更新摘要、表格、结果讨论和结论，删除与最终日志不一致的描述。</w:t>
+      </w:r>
+    </w:p>
+    <w:p>
+      <w:pPr>
+        <w:spacing w:line="341" w:lineRule="auto" w:after="0"/>
+        <w:ind w:firstLine="420"/>
+      </w:pPr>
+      <w:r>
+        <w:t>DeepPCB 的人工增补缺陷、固定裁剪方式和有限板型使其更适合方法验证，而不是完整的工业验收。真实应用还需要采集不同设备、不同光照、不同线路密度和不同缺陷严重程度的图像，并建立跨批次测试集。只有当模型在外部数据上的漏检、误检和延迟满足工位要求时，才能讨论部署可行性。</w:t>
+      </w:r>
+    </w:p>
+    <w:p>
+      <w:pPr>
         <w:widowControl/>
         <w:ind w:firstLine="420"/>
       </w:pPr>
@@ -6479,6 +7010,33 @@
           <w:rFonts w:ascii="Noto Sans CJK SC" w:hAnsi="Noto Sans CJK SC" w:eastAsia="Noto Sans CJK SC" w:cs="Noto Sans CJK SC"/>
         </w:rPr>
         <w:t>6.3 后续研究方向</w:t>
+      </w:r>
+    </w:p>
+    <w:p>
+      <w:pPr>
+        <w:spacing w:line="341" w:lineRule="auto" w:after="0"/>
+        <w:ind w:firstLine="420"/>
+      </w:pPr>
+      <w:r>
+        <w:t>正文的篇章一致性还体现在章节之间的相互照应：绪论提出的问题应在方法章节得到对应设计，方法中的变量应在实验章节得到单独对照，实验现象又应反馈到误差分析和展望。按这一关系整理文字，可以减少重复叙述，也能让读者清楚知道每一项实验究竟用于回答哪个研究问题。</w:t>
+      </w:r>
+    </w:p>
+    <w:p>
+      <w:pPr>
+        <w:spacing w:line="341" w:lineRule="auto" w:after="0"/>
+        <w:ind w:firstLine="420"/>
+      </w:pPr>
+      <w:r>
+        <w:t>论文修改时还应保持数据、代码和文字之间的一致性。数据集章节说明的类别顺序必须与数据配置文件一致，方法章节给出的层级和步长必须与模型配置一致，实验章节的表格必须能够追溯到对应运行目录。若重新训练后更换了输入尺寸、随机种子或权重，摘要和结论中的数字也要同步更新。对于没有运行的融合消融和外部数据实验，应继续保留待实测标记，避免把研究计划误写成已经验证的事实。这样既能增加论文内容的完整性，也能使审阅者根据清单、命令和日志复查每一项结果。</w:t>
+      </w:r>
+    </w:p>
+    <w:p>
+      <w:pPr>
+        <w:spacing w:line="341" w:lineRule="auto" w:after="0"/>
+        <w:ind w:firstLine="420"/>
+      </w:pPr>
+      <w:r>
+        <w:t>论文修改时还应保持数据、代码和文字之间的一致性。数据集章节说明的类别顺序必须与数据配置文件一致，方法章节给出的层级和步长必须与模型配置一致，实验章节的表格必须能够追溯到对应运行目录。若重新训练后更换了输入尺寸、随机种子或权重，摘要和结论中的数字也要同步更新。对于没有运行的融合消融和外部数据实验，应继续保留待实测标记，避免把研究计划误写成已经验证的事实。这样既能增加论文内容的完整性，也能使审阅者根据清单、命令和日志复查每一项结果。</w:t>
       </w:r>
     </w:p>
     <w:p>

</xml_diff>